<commit_message>
docs(identity): weigh the patterns the proposal only hypothesised
The proposal's §6.4 names candidate patterns as a hypothesis, not a
conclusion, and ONBOARDING.md asks for that comparison to be made rather
than assumed away. §2.3 argued from the shape of the problem statement
but never said what it had rejected.

It now weighs the three nearest alternatives against the clauses of the
problem statement: Strategy without the template method, which isolates
the varying step but leaves nothing guaranteeing that every route ends in
one session; a factory, which answers only which strategy runs, never what
stays fixed once one is chosen; and a chain of responsibility, whose
probing semantics contradict a caller-stated kind and blur the deliberate
split between invalid_credentials and unsupported_kind.

Regenerates design.docx from the changed source.

Co-Authored-By: Claude Opus 5 <noreply@anthropic.com>
Claude-Session: https://claude.ai/code/session_0123F5fqBrLEATrpQFAviUji
</commit_message>
<xml_diff>
--- a/docs/luyi/design.docx
+++ b/docs/luyi/design.docx
@@ -4894,6 +4894,162 @@
         <w:pStyle w:val="3"/>
       </w:pPr>
       <w:r>
+        <w:rPr>
+          <w:b/>
+          <w:bCs/>
+        </w:rPr>
+        <w:t xml:space="preserve">Considered and rejected.</w:t>
+      </w:r>
+      <w:r>
+        <w:t xml:space="preserve"> The proposal’s §6.4 names candidate patterns as a hypothesis, not a conclusion, so the three nearest alternatives are compared here rather than assumed away.</w:t>
+      </w:r>
+    </w:p>
+    <w:p>
+      <w:pPr>
+        <w:pStyle w:val="24"/>
+        <w:numPr>
+          <w:ilvl w:val="0"/>
+          <w:numId w:val="1007"/>
+        </w:numPr>
+      </w:pPr>
+      <w:r>
+        <w:rPr>
+          <w:b/>
+          <w:bCs/>
+        </w:rPr>
+        <w:t xml:space="preserve">Strategy alone, without the template method.</w:t>
+      </w:r>
+      <w:r>
+        <w:t xml:space="preserve"> Each of the four strategies implements the whole flow. The varying step is isolated, but nothing then guarantees that “all of them must end in one session”: every strategy has to remember to call </w:t>
+      </w:r>
+      <w:r>
+        <w:rPr>
+          <w:rStyle w:val="48"/>
+        </w:rPr>
+        <w:t xml:space="preserve">onAuthenticated()</w:t>
+      </w:r>
+      <w:r>
+        <w:t>, and one that forgets is a login route issuing no session. The fifth way in has to remember it too. The second clause of the problem statement asks for exactly that guarantee, so Strategy on its own does not answer it.</w:t>
+      </w:r>
+    </w:p>
+    <w:p>
+      <w:pPr>
+        <w:pStyle w:val="24"/>
+        <w:numPr>
+          <w:ilvl w:val="0"/>
+          <w:numId w:val="1007"/>
+        </w:numPr>
+      </w:pPr>
+      <w:r>
+        <w:rPr>
+          <w:b/>
+          <w:bCs/>
+        </w:rPr>
+        <w:t xml:space="preserve">A factory.</w:t>
+      </w:r>
+      <w:r>
+        <w:t xml:space="preserve"> It produces the right handler for a </w:t>
+      </w:r>
+      <w:r>
+        <w:rPr>
+          <w:rStyle w:val="48"/>
+        </w:rPr>
+        <w:t xml:space="preserve">kind</w:t>
+      </w:r>
+      <w:r>
+        <w:t xml:space="preserve">, but it answers only </w:t>
+      </w:r>
+      <w:r>
+        <w:rPr>
+          <w:i/>
+          <w:iCs/>
+        </w:rPr>
+        <w:t xml:space="preserve">which one</w:t>
+      </w:r>
+      <w:r>
+        <w:t xml:space="preserve">, never </w:t>
+      </w:r>
+      <w:r>
+        <w:rPr>
+          <w:i/>
+          <w:iCs/>
+        </w:rPr>
+        <w:t xml:space="preserve">what stays fixed once one is chosen</w:t>
+      </w:r>
+      <w:r>
+        <w:t xml:space="preserve">. The lookup in </w:t>
+      </w:r>
+      <w:r>
+        <w:rPr>
+          <w:rStyle w:val="48"/>
+        </w:rPr>
+        <w:t xml:space="preserve">strategies()</w:t>
+      </w:r>
+      <w:r>
+        <w:t xml:space="preserve"> already answers </w:t>
+      </w:r>
+      <w:r>
+        <w:rPr>
+          <w:i/>
+          <w:iCs/>
+        </w:rPr>
+        <w:t xml:space="preserve">which one</w:t>
+      </w:r>
+      <w:r>
+        <w:t>, so a factory above it adds no constraint that the problem statement asks for.</w:t>
+      </w:r>
+    </w:p>
+    <w:p>
+      <w:pPr>
+        <w:pStyle w:val="24"/>
+        <w:numPr>
+          <w:ilvl w:val="0"/>
+          <w:numId w:val="1007"/>
+        </w:numPr>
+      </w:pPr>
+      <w:r>
+        <w:rPr>
+          <w:b/>
+          <w:bCs/>
+        </w:rPr>
+        <w:t xml:space="preserve">Chain of responsibility.</w:t>
+      </w:r>
+      <w:r>
+        <w:t xml:space="preserve"> Four handlers try in turn until one claims the request. It would run, but the semantics are wrong: </w:t>
+      </w:r>
+      <w:r>
+        <w:rPr>
+          <w:rStyle w:val="48"/>
+        </w:rPr>
+        <w:t xml:space="preserve">kind</w:t>
+      </w:r>
+      <w:r>
+        <w:t xml:space="preserve"> is stated by the caller, so nothing needs probing. It also makes “wrong password” hard to separate from “no such kind”, which contradicts §3.6, where </w:t>
+      </w:r>
+      <w:r>
+        <w:rPr>
+          <w:rStyle w:val="48"/>
+        </w:rPr>
+        <w:t xml:space="preserve">invalid_credentials</w:t>
+      </w:r>
+      <w:r>
+        <w:t xml:space="preserve"> and </w:t>
+      </w:r>
+      <w:r>
+        <w:rPr>
+          <w:rStyle w:val="48"/>
+        </w:rPr>
+        <w:t xml:space="preserve">unsupported_kind</w:t>
+      </w:r>
+      <w:r>
+        <w:t xml:space="preserve"> are deliberately distinct codes.</w:t>
+      </w:r>
+    </w:p>
+    <w:p>
+      <w:pPr>
+        <w:pStyle w:val="23"/>
+      </w:pPr>
+      <w:r>
         <w:t xml:space="preserve">A fourth consequence is not in the problem statement but matters for the Definition of Done: each </w:t>
       </w:r>
       <w:r>
@@ -7086,7 +7242,7 @@
         <w:pStyle w:val="24"/>
         <w:numPr>
           <w:ilvl w:val="0"/>
-          <w:numId w:val="1007"/>
+          <w:numId w:val="1008"/>
         </w:numPr>
       </w:pPr>
       <w:r>
@@ -7122,7 +7278,7 @@
         <w:pStyle w:val="24"/>
         <w:numPr>
           <w:ilvl w:val="0"/>
-          <w:numId w:val="1007"/>
+          <w:numId w:val="1008"/>
         </w:numPr>
       </w:pPr>
       <w:r>
@@ -7158,7 +7314,7 @@
         <w:pStyle w:val="24"/>
         <w:numPr>
           <w:ilvl w:val="0"/>
-          <w:numId w:val="1007"/>
+          <w:numId w:val="1008"/>
         </w:numPr>
       </w:pPr>
       <w:r>
@@ -12868,6 +13024,9 @@
     <w:abstractNumId w:val="991"/>
   </w:num>
   <w:num w:numId="1007">
+    <w:abstractNumId w:val="991"/>
+  </w:num>
+  <w:num w:numId="1008">
     <w:abstractNumId w:val="99411"/>
     <w:lvlOverride w:ilvl="0">
       <w:startOverride w:val="1"/>

</xml_diff>